<commit_message>
Add shared drug dictionary and network analysis deps
</commit_message>
<xml_diff>
--- a/thesis_before_text_optimization.docx
+++ b/thesis_before_text_optimization.docx
@@ -17429,6 +17429,64 @@
           <w:sz w:val="21"/>
         </w:rPr>
         <w:t>。</w:t>
+      </w:r>
+    </w:p>
+    <w:p>
+      <w:pPr>
+        <w:pStyle w:val="31"/>
+        <w:spacing w:before="160" w:after="80"/>
+        <w:jc w:val="left"/>
+      </w:pPr>
+      <w:r/>
+      <w:r>
+        <w:rPr>
+          <w:rFonts w:ascii="Times New Roman" w:hAnsi="Times New Roman" w:eastAsia="黑体"/>
+          <w:b/>
+          <w:sz w:val="24"/>
+        </w:rPr>
+        <w:t>2.7.7 年度趋势与监管节点分层分析</w:t>
+      </w:r>
+    </w:p>
+    <w:p>
+      <w:pPr>
+        <w:spacing w:line="360" w:lineRule="auto" w:before="0" w:after="120"/>
+        <w:ind w:firstLine="420"/>
+      </w:pPr>
+      <w:r>
+        <w:rPr>
+          <w:rFonts w:ascii="Times New Roman" w:hAnsi="Times New Roman" w:eastAsia="宋体"/>
+          <w:b w:val="0"/>
+          <w:sz w:val="21"/>
+        </w:rPr>
+      </w:r>
+      <w:r>
+        <w:rPr>
+          <w:rFonts w:ascii="Times New Roman" w:hAnsi="Times New Roman" w:eastAsia="宋体"/>
+          <w:b w:val="0"/>
+          <w:sz w:val="21"/>
+        </w:rPr>
+        <w:t>为进一步利用 2004-2025 年长时间跨度数据，本研究在主分析口径基础上补充年度趋势和监管节点前后分层分析。趋势分析继续复用全周期病例级分析数据集、唑吡坦 suspect 暴露定义、狭义跌倒和广义跌倒结局定义，以及与主分析一致的四格表和信号指标计算函数。主分析趋势口径仍为 PS+SS 暴露，且排除同时包含唑吡坦和其他 Z-drugs suspect 暴露的混合病例。</w:t>
+      </w:r>
+    </w:p>
+    <w:p>
+      <w:pPr>
+        <w:spacing w:line="360" w:lineRule="auto" w:before="0" w:after="120"/>
+        <w:ind w:firstLine="420"/>
+      </w:pPr>
+      <w:r>
+        <w:rPr>
+          <w:rFonts w:ascii="Times New Roman" w:hAnsi="Times New Roman" w:eastAsia="宋体"/>
+          <w:b w:val="0"/>
+          <w:sz w:val="21"/>
+        </w:rPr>
+      </w:r>
+      <w:r>
+        <w:rPr>
+          <w:rFonts w:ascii="Times New Roman" w:hAnsi="Times New Roman" w:eastAsia="宋体"/>
+          <w:b w:val="0"/>
+          <w:sz w:val="21"/>
+        </w:rPr>
+        <w:t>年度趋势分析逐年统计唑吡坦 suspect 报告数、唑吡坦 suspect 中狭义跌倒报告数、跌倒报告比例和年度 ROR。为减少单一年份报告量波动带来的不稳定，本研究同时采用 3 年滚动窗口计算 ROR。监管节点分层分析以 2013 年 FDA 唑吡坦剂量安全沟通和 2019 年 Z-drugs 黑框警告作为主要时间节点，分别比较节点前后唑吡坦相关狭义跌倒报告比例和 ROR。上述分析均属于描述性报告趋势分析，不能解释为监管措施造成风险变化的因果效应。</w:t>
       </w:r>
     </w:p>
     <w:p>
@@ -28709,78 +28767,1078 @@
     <w:p/>
     <w:p>
       <w:pPr>
-        <w:spacing w:after="120" w:line="360" w:lineRule="auto"/>
+        <w:spacing w:after="120" w:line="360" w:lineRule="auto" w:before="0"/>
         <w:ind w:firstLine="420"/>
       </w:pPr>
       <w:r>
         <w:rPr>
-          <w:sz w:val="21"/>
-        </w:rPr>
-        <w:lastRenderedPageBreak/>
-        <w:t>该结果提示，在</w:t>
-      </w:r>
-      <w:r>
-        <w:rPr>
-          <w:sz w:val="21"/>
-        </w:rPr>
-        <w:t xml:space="preserve"> FAERS </w:t>
-      </w:r>
-      <w:r>
-        <w:rPr>
-          <w:sz w:val="21"/>
-        </w:rPr>
-        <w:t>老年病例报告中，唑吡坦</w:t>
-      </w:r>
-      <w:r>
-        <w:rPr>
-          <w:sz w:val="21"/>
-        </w:rPr>
-        <w:t xml:space="preserve"> suspect </w:t>
-      </w:r>
-      <w:r>
-        <w:rPr>
-          <w:sz w:val="21"/>
-        </w:rPr>
-        <w:t>暴露病例中狭义跌倒事件的报告比例高于其他可疑药物病例。需要强调的是，这一结果表示报告信号增强，而不是直接证明唑吡坦导致跌倒。既往指南、</w:t>
-      </w:r>
-      <w:r>
-        <w:rPr>
-          <w:sz w:val="21"/>
-        </w:rPr>
-        <w:t xml:space="preserve">FDA </w:t>
-      </w:r>
-      <w:r>
-        <w:rPr>
-          <w:sz w:val="21"/>
-        </w:rPr>
-        <w:t>安全警示和观察性研究已提示</w:t>
-      </w:r>
-      <w:r>
-        <w:rPr>
-          <w:sz w:val="21"/>
-        </w:rPr>
-        <w:t xml:space="preserve"> Z-drugs </w:t>
-      </w:r>
-      <w:r>
-        <w:rPr>
-          <w:sz w:val="21"/>
-        </w:rPr>
-        <w:t>在老年人中存在跌倒、骨折、次日损害和复杂睡眠行为等安全问题，本研究结果与这些外部证据方向一致</w:t>
-      </w:r>
-      <w:r>
-        <w:rPr>
-          <w:sz w:val="18"/>
-          <w:vertAlign w:val="superscript"/>
-        </w:rPr>
-        <w:t>[1,9-22,69-70]</w:t>
-      </w:r>
-      <w:r>
-        <w:rPr>
-          <w:sz w:val="21"/>
-        </w:rPr>
-        <w:t>。</w:t>
-      </w:r>
-    </w:p>
+          <w:rFonts w:ascii="Times New Roman" w:hAnsi="Times New Roman" w:eastAsia="宋体"/>
+          <w:b w:val="0"/>
+          <w:sz w:val="21"/>
+        </w:rPr>
+        <w:t>该结果提示，在 FAERS 老年病例报告中，唑吡坦 suspect 暴露病例中狭义跌倒事件的报告比例高于非唑吡坦 suspect 参照组病例。需要强调的是，这一结果表示报告信号增强，而不是直接证明唑吡坦导致跌倒。既往指南、FDA 安全警示和观察性研究已提示 Z-drugs 在老年人中存在跌倒、骨折、次日损害和复杂睡眠行为等安全问题，本研究结果与这些外部证据方向一致[1,9-22,69-70]。</w:t>
+      </w:r>
+    </w:p>
+    <w:p>
+      <w:pPr>
+        <w:pStyle w:val="31"/>
+        <w:spacing w:before="160" w:after="80"/>
+        <w:jc w:val="left"/>
+      </w:pPr>
+      <w:r/>
+      <w:r>
+        <w:rPr>
+          <w:rFonts w:ascii="Times New Roman" w:hAnsi="Times New Roman" w:eastAsia="黑体"/>
+          <w:b/>
+          <w:sz w:val="24"/>
+        </w:rPr>
+        <w:t>4.1.1 年度趋势与监管节点前后分层分析</w:t>
+      </w:r>
+    </w:p>
+    <w:p>
+      <w:pPr>
+        <w:spacing w:line="360" w:lineRule="auto" w:before="0" w:after="120"/>
+        <w:ind w:firstLine="420"/>
+      </w:pPr>
+      <w:r>
+        <w:rPr>
+          <w:rFonts w:ascii="Times New Roman" w:hAnsi="Times New Roman" w:eastAsia="宋体"/>
+          <w:b w:val="0"/>
+          <w:sz w:val="21"/>
+        </w:rPr>
+      </w:r>
+      <w:r>
+        <w:rPr>
+          <w:rFonts w:ascii="Times New Roman" w:hAnsi="Times New Roman" w:eastAsia="宋体"/>
+          <w:b w:val="0"/>
+          <w:sz w:val="21"/>
+        </w:rPr>
+        <w:t>在主分析口径下，本研究进一步观察 2004-2025 年唑吡坦相关狭义跌倒报告的年度变化和监管节点前后分层结果。全周期中，唑吡坦 suspect 暴露组狭义跌倒报告比例为 13.38%，非唑吡坦 suspect 参照组为 3.16%，全周期 ROR 为 4.73（95%CI：4.43-5.05）。</w:t>
+      </w:r>
+    </w:p>
+    <w:p>
+      <w:pPr>
+        <w:spacing w:line="360" w:lineRule="auto" w:before="0" w:after="120"/>
+        <w:ind w:firstLine="420"/>
+      </w:pPr>
+      <w:r>
+        <w:rPr>
+          <w:rFonts w:ascii="Times New Roman" w:hAnsi="Times New Roman" w:eastAsia="宋体"/>
+          <w:b w:val="0"/>
+          <w:sz w:val="21"/>
+        </w:rPr>
+      </w:r>
+      <w:r>
+        <w:rPr>
+          <w:rFonts w:ascii="Times New Roman" w:hAnsi="Times New Roman" w:eastAsia="宋体"/>
+          <w:b w:val="0"/>
+          <w:sz w:val="21"/>
+        </w:rPr>
+        <w:t>以 2013 年 FDA 唑吡坦剂量安全沟通为节点，2013 年前唑吡坦 suspect 暴露组狭义跌倒报告比例为 15.46%，ROR 为 4.84（95%CI：4.23-5.54）；2013 年后报告比例为 12.83%，ROR 为 4.63（95%CI：4.29-4.99）。这一结果提示，2013 年后唑吡坦相关跌倒报告比例有所降低，但不成比例报告信号仍持续存在。</w:t>
+      </w:r>
+    </w:p>
+    <w:p>
+      <w:pPr>
+        <w:spacing w:line="360" w:lineRule="auto" w:before="0" w:after="120"/>
+        <w:ind w:firstLine="420"/>
+      </w:pPr>
+      <w:r>
+        <w:rPr>
+          <w:rFonts w:ascii="Times New Roman" w:hAnsi="Times New Roman" w:eastAsia="宋体"/>
+          <w:b w:val="0"/>
+          <w:sz w:val="21"/>
+        </w:rPr>
+      </w:r>
+      <w:r>
+        <w:rPr>
+          <w:rFonts w:ascii="Times New Roman" w:hAnsi="Times New Roman" w:eastAsia="宋体"/>
+          <w:b w:val="0"/>
+          <w:sz w:val="21"/>
+        </w:rPr>
+        <w:t>以 2019 年 Z-drugs 黑框警告为节点，2019 年前唑吡坦 suspect 暴露组狭义跌倒报告比例为 13.41%，ROR 为 4.44（95%CI：4.07-4.84）；2019 年后报告比例为 13.32%，ROR 为 5.02（95%CI：4.54-5.55）。这说明在 2019 年后时期，FAERS 中唑吡坦相关狭义跌倒报告信号仍保持较高水平。</w:t>
+      </w:r>
+    </w:p>
+    <w:p>
+      <w:pPr>
+        <w:spacing w:line="360" w:lineRule="auto" w:before="0" w:after="120"/>
+        <w:ind w:firstLine="420"/>
+      </w:pPr>
+      <w:r>
+        <w:rPr>
+          <w:rFonts w:ascii="Times New Roman" w:hAnsi="Times New Roman" w:eastAsia="宋体"/>
+          <w:sz w:val="21"/>
+        </w:rPr>
+        <w:t>表 4-1-1 显示 2013 年和 2019 年监管节点前后的主要分层结果。</w:t>
+      </w:r>
+    </w:p>
+    <w:p>
+      <w:r/>
+    </w:p>
+    <w:p>
+      <w:pPr>
+        <w:spacing w:line="360" w:lineRule="auto" w:before="0" w:after="120"/>
+        <w:ind w:firstLine="420"/>
+      </w:pPr>
+      <w:r>
+        <w:rPr>
+          <w:rFonts w:ascii="Times New Roman" w:hAnsi="Times New Roman" w:eastAsia="宋体"/>
+          <w:b w:val="0"/>
+          <w:sz w:val="21"/>
+        </w:rPr>
+      </w:r>
+      <w:r>
+        <w:rPr>
+          <w:rFonts w:ascii="Times New Roman" w:hAnsi="Times New Roman" w:eastAsia="宋体"/>
+          <w:b w:val="0"/>
+          <w:sz w:val="21"/>
+        </w:rPr>
+        <w:t>年度分析显示，2004-2025 年间唑吡坦相关狭义跌倒报告比例和年度 ROR 存在一定波动。单年结果中，2007 年和 2025 年的跌倒报告比例及 ROR 相对较高。3 年滚动窗口分析进一步显示，该信号并非由单一年份驱动；例如 2023-2025 年窗口中唑吡坦 suspect 暴露组狭义跌倒报告比例为 13.85%，ROR 为 5.51（95%CI：4.69-6.48）。需要强调的是，年度趋势和监管节点分层只能反映 FAERS 报告模式变化，不能直接解释为真实临床发生率变化或 FDA 警示的因果影响。</w:t>
+      </w:r>
+    </w:p>
+    <w:tbl>
+      <w:tblPr>
+        <w:tblStyle w:val="aff1"/>
+        <w:tblW w:type="auto" w:w="0"/>
+        <w:tblLayout w:type="autofit"/>
+        <w:tblLook w:firstColumn="1" w:firstRow="1" w:lastColumn="0" w:lastRow="0" w:noHBand="0" w:noVBand="1" w:val="04A0"/>
+      </w:tblPr>
+      <w:tblGrid>
+        <w:gridCol w:w="1296"/>
+        <w:gridCol w:w="1296"/>
+        <w:gridCol w:w="1296"/>
+        <w:gridCol w:w="1296"/>
+        <w:gridCol w:w="1296"/>
+        <w:gridCol w:w="1296"/>
+        <w:gridCol w:w="1296"/>
+      </w:tblGrid>
+      <w:tr>
+        <w:tc>
+          <w:tcPr>
+            <w:tcW w:type="dxa" w:w="1296"/>
+            <w:vAlign w:val="center"/>
+            <w:tcMar>
+              <w:top w:w="80" w:type="dxa"/>
+              <w:start w:w="100" w:type="dxa"/>
+              <w:bottom w:w="80" w:type="dxa"/>
+              <w:end w:w="100" w:type="dxa"/>
+            </w:tcMar>
+            <w:shd w:fill="EDEDED"/>
+          </w:tcPr>
+          <w:p>
+            <w:pPr>
+              <w:spacing w:after="0" w:line="288" w:lineRule="auto"/>
+              <w:jc w:val="center"/>
+            </w:pPr>
+            <w:r>
+              <w:rPr>
+                <w:rFonts w:ascii="Times New Roman" w:hAnsi="Times New Roman" w:eastAsia="宋体"/>
+                <w:b/>
+                <w:sz w:val="17"/>
+              </w:rPr>
+              <w:t>监管节点</w:t>
+            </w:r>
+          </w:p>
+        </w:tc>
+        <w:tc>
+          <w:tcPr>
+            <w:tcW w:type="dxa" w:w="1296"/>
+            <w:vAlign w:val="center"/>
+            <w:tcMar>
+              <w:top w:w="80" w:type="dxa"/>
+              <w:start w:w="100" w:type="dxa"/>
+              <w:bottom w:w="80" w:type="dxa"/>
+              <w:end w:w="100" w:type="dxa"/>
+            </w:tcMar>
+            <w:shd w:fill="EDEDED"/>
+          </w:tcPr>
+          <w:p>
+            <w:pPr>
+              <w:spacing w:after="0" w:line="288" w:lineRule="auto"/>
+              <w:jc w:val="center"/>
+            </w:pPr>
+            <w:r>
+              <w:rPr>
+                <w:rFonts w:ascii="Times New Roman" w:hAnsi="Times New Roman" w:eastAsia="宋体"/>
+                <w:b/>
+                <w:sz w:val="17"/>
+              </w:rPr>
+              <w:t>时期</w:t>
+            </w:r>
+          </w:p>
+        </w:tc>
+        <w:tc>
+          <w:tcPr>
+            <w:tcW w:type="dxa" w:w="1296"/>
+            <w:vAlign w:val="center"/>
+            <w:tcMar>
+              <w:top w:w="80" w:type="dxa"/>
+              <w:start w:w="100" w:type="dxa"/>
+              <w:bottom w:w="80" w:type="dxa"/>
+              <w:end w:w="100" w:type="dxa"/>
+            </w:tcMar>
+            <w:shd w:fill="EDEDED"/>
+          </w:tcPr>
+          <w:p>
+            <w:pPr>
+              <w:spacing w:after="0" w:line="288" w:lineRule="auto"/>
+              <w:jc w:val="center"/>
+            </w:pPr>
+            <w:r>
+              <w:rPr>
+                <w:rFonts w:ascii="Times New Roman" w:hAnsi="Times New Roman" w:eastAsia="宋体"/>
+                <w:b/>
+                <w:sz w:val="17"/>
+              </w:rPr>
+              <w:t>唑吡坦suspect病例</w:t>
+            </w:r>
+          </w:p>
+        </w:tc>
+        <w:tc>
+          <w:tcPr>
+            <w:tcW w:type="dxa" w:w="1296"/>
+            <w:vAlign w:val="center"/>
+            <w:tcMar>
+              <w:top w:w="80" w:type="dxa"/>
+              <w:start w:w="100" w:type="dxa"/>
+              <w:bottom w:w="80" w:type="dxa"/>
+              <w:end w:w="100" w:type="dxa"/>
+            </w:tcMar>
+            <w:shd w:fill="EDEDED"/>
+          </w:tcPr>
+          <w:p>
+            <w:pPr>
+              <w:spacing w:after="0" w:line="288" w:lineRule="auto"/>
+              <w:jc w:val="center"/>
+            </w:pPr>
+            <w:r>
+              <w:rPr>
+                <w:rFonts w:ascii="Times New Roman" w:hAnsi="Times New Roman" w:eastAsia="宋体"/>
+                <w:b/>
+                <w:sz w:val="17"/>
+              </w:rPr>
+              <w:t>狭义跌倒</w:t>
+            </w:r>
+          </w:p>
+        </w:tc>
+        <w:tc>
+          <w:tcPr>
+            <w:tcW w:type="dxa" w:w="1296"/>
+            <w:vAlign w:val="center"/>
+            <w:tcMar>
+              <w:top w:w="80" w:type="dxa"/>
+              <w:start w:w="100" w:type="dxa"/>
+              <w:bottom w:w="80" w:type="dxa"/>
+              <w:end w:w="100" w:type="dxa"/>
+            </w:tcMar>
+            <w:shd w:fill="EDEDED"/>
+          </w:tcPr>
+          <w:p>
+            <w:pPr>
+              <w:spacing w:after="0" w:line="288" w:lineRule="auto"/>
+              <w:jc w:val="center"/>
+            </w:pPr>
+            <w:r>
+              <w:rPr>
+                <w:rFonts w:ascii="Times New Roman" w:hAnsi="Times New Roman" w:eastAsia="宋体"/>
+                <w:b/>
+                <w:sz w:val="17"/>
+              </w:rPr>
+              <w:t>暴露组报告比例</w:t>
+            </w:r>
+          </w:p>
+        </w:tc>
+        <w:tc>
+          <w:tcPr>
+            <w:tcW w:type="dxa" w:w="1296"/>
+            <w:vAlign w:val="center"/>
+            <w:tcMar>
+              <w:top w:w="80" w:type="dxa"/>
+              <w:start w:w="100" w:type="dxa"/>
+              <w:bottom w:w="80" w:type="dxa"/>
+              <w:end w:w="100" w:type="dxa"/>
+            </w:tcMar>
+            <w:shd w:fill="EDEDED"/>
+          </w:tcPr>
+          <w:p>
+            <w:pPr>
+              <w:spacing w:after="0" w:line="288" w:lineRule="auto"/>
+              <w:jc w:val="center"/>
+            </w:pPr>
+            <w:r>
+              <w:rPr>
+                <w:rFonts w:ascii="Times New Roman" w:hAnsi="Times New Roman" w:eastAsia="宋体"/>
+                <w:b/>
+                <w:sz w:val="17"/>
+              </w:rPr>
+              <w:t>参照组报告比例</w:t>
+            </w:r>
+          </w:p>
+        </w:tc>
+        <w:tc>
+          <w:tcPr>
+            <w:tcW w:type="dxa" w:w="1296"/>
+            <w:vAlign w:val="center"/>
+            <w:tcMar>
+              <w:top w:w="80" w:type="dxa"/>
+              <w:start w:w="100" w:type="dxa"/>
+              <w:bottom w:w="80" w:type="dxa"/>
+              <w:end w:w="100" w:type="dxa"/>
+            </w:tcMar>
+            <w:shd w:fill="EDEDED"/>
+          </w:tcPr>
+          <w:p>
+            <w:pPr>
+              <w:spacing w:after="0" w:line="288" w:lineRule="auto"/>
+              <w:jc w:val="center"/>
+            </w:pPr>
+            <w:r>
+              <w:rPr>
+                <w:rFonts w:ascii="Times New Roman" w:hAnsi="Times New Roman" w:eastAsia="宋体"/>
+                <w:b/>
+                <w:sz w:val="17"/>
+              </w:rPr>
+              <w:t>ROR（95%CI）</w:t>
+            </w:r>
+          </w:p>
+        </w:tc>
+      </w:tr>
+      <w:tr>
+        <w:tc>
+          <w:tcPr>
+            <w:tcW w:type="dxa" w:w="1296"/>
+            <w:vAlign w:val="center"/>
+            <w:tcMar>
+              <w:top w:w="80" w:type="dxa"/>
+              <w:start w:w="100" w:type="dxa"/>
+              <w:bottom w:w="80" w:type="dxa"/>
+              <w:end w:w="100" w:type="dxa"/>
+            </w:tcMar>
+          </w:tcPr>
+          <w:p>
+            <w:pPr>
+              <w:spacing w:after="0" w:line="288" w:lineRule="auto"/>
+              <w:jc w:val="center"/>
+            </w:pPr>
+            <w:r>
+              <w:rPr>
+                <w:rFonts w:ascii="Times New Roman" w:hAnsi="Times New Roman" w:eastAsia="宋体"/>
+                <w:b w:val="0"/>
+                <w:sz w:val="17"/>
+              </w:rPr>
+              <w:t>2013 FDA剂量安全沟通</w:t>
+            </w:r>
+          </w:p>
+        </w:tc>
+        <w:tc>
+          <w:tcPr>
+            <w:tcW w:type="dxa" w:w="1296"/>
+            <w:vAlign w:val="center"/>
+            <w:tcMar>
+              <w:top w:w="80" w:type="dxa"/>
+              <w:start w:w="100" w:type="dxa"/>
+              <w:bottom w:w="80" w:type="dxa"/>
+              <w:end w:w="100" w:type="dxa"/>
+            </w:tcMar>
+          </w:tcPr>
+          <w:p>
+            <w:pPr>
+              <w:spacing w:after="0" w:line="288" w:lineRule="auto"/>
+              <w:jc w:val="center"/>
+            </w:pPr>
+            <w:r>
+              <w:rPr>
+                <w:rFonts w:ascii="Times New Roman" w:hAnsi="Times New Roman" w:eastAsia="宋体"/>
+                <w:b w:val="0"/>
+                <w:sz w:val="17"/>
+              </w:rPr>
+              <w:t>2004-2012</w:t>
+            </w:r>
+          </w:p>
+        </w:tc>
+        <w:tc>
+          <w:tcPr>
+            <w:tcW w:type="dxa" w:w="1296"/>
+            <w:vAlign w:val="center"/>
+            <w:tcMar>
+              <w:top w:w="80" w:type="dxa"/>
+              <w:start w:w="100" w:type="dxa"/>
+              <w:bottom w:w="80" w:type="dxa"/>
+              <w:end w:w="100" w:type="dxa"/>
+            </w:tcMar>
+          </w:tcPr>
+          <w:p>
+            <w:pPr>
+              <w:spacing w:after="0" w:line="288" w:lineRule="auto"/>
+              <w:jc w:val="center"/>
+            </w:pPr>
+            <w:r>
+              <w:rPr>
+                <w:rFonts w:ascii="Times New Roman" w:hAnsi="Times New Roman" w:eastAsia="宋体"/>
+                <w:b w:val="0"/>
+                <w:sz w:val="17"/>
+              </w:rPr>
+              <w:t>1,624</w:t>
+            </w:r>
+          </w:p>
+        </w:tc>
+        <w:tc>
+          <w:tcPr>
+            <w:tcW w:type="dxa" w:w="1296"/>
+            <w:vAlign w:val="center"/>
+            <w:tcMar>
+              <w:top w:w="80" w:type="dxa"/>
+              <w:start w:w="100" w:type="dxa"/>
+              <w:bottom w:w="80" w:type="dxa"/>
+              <w:end w:w="100" w:type="dxa"/>
+            </w:tcMar>
+          </w:tcPr>
+          <w:p>
+            <w:pPr>
+              <w:spacing w:after="0" w:line="288" w:lineRule="auto"/>
+              <w:jc w:val="center"/>
+            </w:pPr>
+            <w:r>
+              <w:rPr>
+                <w:rFonts w:ascii="Times New Roman" w:hAnsi="Times New Roman" w:eastAsia="宋体"/>
+                <w:b w:val="0"/>
+                <w:sz w:val="17"/>
+              </w:rPr>
+              <w:t>251</w:t>
+            </w:r>
+          </w:p>
+        </w:tc>
+        <w:tc>
+          <w:tcPr>
+            <w:tcW w:type="dxa" w:w="1296"/>
+            <w:vAlign w:val="center"/>
+            <w:tcMar>
+              <w:top w:w="80" w:type="dxa"/>
+              <w:start w:w="100" w:type="dxa"/>
+              <w:bottom w:w="80" w:type="dxa"/>
+              <w:end w:w="100" w:type="dxa"/>
+            </w:tcMar>
+          </w:tcPr>
+          <w:p>
+            <w:pPr>
+              <w:spacing w:after="0" w:line="288" w:lineRule="auto"/>
+              <w:jc w:val="center"/>
+            </w:pPr>
+            <w:r>
+              <w:rPr>
+                <w:rFonts w:ascii="Times New Roman" w:hAnsi="Times New Roman" w:eastAsia="宋体"/>
+                <w:b w:val="0"/>
+                <w:sz w:val="17"/>
+              </w:rPr>
+              <w:t>15.46%</w:t>
+            </w:r>
+          </w:p>
+        </w:tc>
+        <w:tc>
+          <w:tcPr>
+            <w:tcW w:type="dxa" w:w="1296"/>
+            <w:vAlign w:val="center"/>
+            <w:tcMar>
+              <w:top w:w="80" w:type="dxa"/>
+              <w:start w:w="100" w:type="dxa"/>
+              <w:bottom w:w="80" w:type="dxa"/>
+              <w:end w:w="100" w:type="dxa"/>
+            </w:tcMar>
+          </w:tcPr>
+          <w:p>
+            <w:pPr>
+              <w:spacing w:after="0" w:line="288" w:lineRule="auto"/>
+              <w:jc w:val="center"/>
+            </w:pPr>
+            <w:r>
+              <w:rPr>
+                <w:rFonts w:ascii="Times New Roman" w:hAnsi="Times New Roman" w:eastAsia="宋体"/>
+                <w:b w:val="0"/>
+                <w:sz w:val="17"/>
+              </w:rPr>
+              <w:t>3.64%</w:t>
+            </w:r>
+          </w:p>
+        </w:tc>
+        <w:tc>
+          <w:tcPr>
+            <w:tcW w:type="dxa" w:w="1296"/>
+            <w:vAlign w:val="center"/>
+            <w:tcMar>
+              <w:top w:w="80" w:type="dxa"/>
+              <w:start w:w="100" w:type="dxa"/>
+              <w:bottom w:w="80" w:type="dxa"/>
+              <w:end w:w="100" w:type="dxa"/>
+            </w:tcMar>
+          </w:tcPr>
+          <w:p>
+            <w:pPr>
+              <w:spacing w:after="0" w:line="288" w:lineRule="auto"/>
+              <w:jc w:val="center"/>
+            </w:pPr>
+            <w:r>
+              <w:rPr>
+                <w:rFonts w:ascii="Times New Roman" w:hAnsi="Times New Roman" w:eastAsia="宋体"/>
+                <w:b w:val="0"/>
+                <w:sz w:val="17"/>
+              </w:rPr>
+              <w:t>4.84 (4.23–5.54)</w:t>
+            </w:r>
+          </w:p>
+        </w:tc>
+      </w:tr>
+      <w:tr>
+        <w:tc>
+          <w:tcPr>
+            <w:tcW w:type="dxa" w:w="1296"/>
+            <w:vAlign w:val="center"/>
+            <w:tcMar>
+              <w:top w:w="80" w:type="dxa"/>
+              <w:start w:w="100" w:type="dxa"/>
+              <w:bottom w:w="80" w:type="dxa"/>
+              <w:end w:w="100" w:type="dxa"/>
+            </w:tcMar>
+          </w:tcPr>
+          <w:p>
+            <w:pPr>
+              <w:spacing w:after="0" w:line="288" w:lineRule="auto"/>
+              <w:jc w:val="center"/>
+            </w:pPr>
+            <w:r>
+              <w:rPr>
+                <w:rFonts w:ascii="Times New Roman" w:hAnsi="Times New Roman" w:eastAsia="宋体"/>
+                <w:b w:val="0"/>
+                <w:sz w:val="17"/>
+              </w:rPr>
+              <w:t>2013 FDA剂量安全沟通</w:t>
+            </w:r>
+          </w:p>
+        </w:tc>
+        <w:tc>
+          <w:tcPr>
+            <w:tcW w:type="dxa" w:w="1296"/>
+            <w:vAlign w:val="center"/>
+            <w:tcMar>
+              <w:top w:w="80" w:type="dxa"/>
+              <w:start w:w="100" w:type="dxa"/>
+              <w:bottom w:w="80" w:type="dxa"/>
+              <w:end w:w="100" w:type="dxa"/>
+            </w:tcMar>
+          </w:tcPr>
+          <w:p>
+            <w:pPr>
+              <w:spacing w:after="0" w:line="288" w:lineRule="auto"/>
+              <w:jc w:val="center"/>
+            </w:pPr>
+            <w:r>
+              <w:rPr>
+                <w:rFonts w:ascii="Times New Roman" w:hAnsi="Times New Roman" w:eastAsia="宋体"/>
+                <w:b w:val="0"/>
+                <w:sz w:val="17"/>
+              </w:rPr>
+              <w:t>2013-2025</w:t>
+            </w:r>
+          </w:p>
+        </w:tc>
+        <w:tc>
+          <w:tcPr>
+            <w:tcW w:type="dxa" w:w="1296"/>
+            <w:vAlign w:val="center"/>
+            <w:tcMar>
+              <w:top w:w="80" w:type="dxa"/>
+              <w:start w:w="100" w:type="dxa"/>
+              <w:bottom w:w="80" w:type="dxa"/>
+              <w:end w:w="100" w:type="dxa"/>
+            </w:tcMar>
+          </w:tcPr>
+          <w:p>
+            <w:pPr>
+              <w:spacing w:after="0" w:line="288" w:lineRule="auto"/>
+              <w:jc w:val="center"/>
+            </w:pPr>
+            <w:r>
+              <w:rPr>
+                <w:rFonts w:ascii="Times New Roman" w:hAnsi="Times New Roman" w:eastAsia="宋体"/>
+                <w:b w:val="0"/>
+                <w:sz w:val="17"/>
+              </w:rPr>
+              <w:t>6,174</w:t>
+            </w:r>
+          </w:p>
+        </w:tc>
+        <w:tc>
+          <w:tcPr>
+            <w:tcW w:type="dxa" w:w="1296"/>
+            <w:vAlign w:val="center"/>
+            <w:tcMar>
+              <w:top w:w="80" w:type="dxa"/>
+              <w:start w:w="100" w:type="dxa"/>
+              <w:bottom w:w="80" w:type="dxa"/>
+              <w:end w:w="100" w:type="dxa"/>
+            </w:tcMar>
+          </w:tcPr>
+          <w:p>
+            <w:pPr>
+              <w:spacing w:after="0" w:line="288" w:lineRule="auto"/>
+              <w:jc w:val="center"/>
+            </w:pPr>
+            <w:r>
+              <w:rPr>
+                <w:rFonts w:ascii="Times New Roman" w:hAnsi="Times New Roman" w:eastAsia="宋体"/>
+                <w:b w:val="0"/>
+                <w:sz w:val="17"/>
+              </w:rPr>
+              <w:t>792</w:t>
+            </w:r>
+          </w:p>
+        </w:tc>
+        <w:tc>
+          <w:tcPr>
+            <w:tcW w:type="dxa" w:w="1296"/>
+            <w:vAlign w:val="center"/>
+            <w:tcMar>
+              <w:top w:w="80" w:type="dxa"/>
+              <w:start w:w="100" w:type="dxa"/>
+              <w:bottom w:w="80" w:type="dxa"/>
+              <w:end w:w="100" w:type="dxa"/>
+            </w:tcMar>
+          </w:tcPr>
+          <w:p>
+            <w:pPr>
+              <w:spacing w:after="0" w:line="288" w:lineRule="auto"/>
+              <w:jc w:val="center"/>
+            </w:pPr>
+            <w:r>
+              <w:rPr>
+                <w:rFonts w:ascii="Times New Roman" w:hAnsi="Times New Roman" w:eastAsia="宋体"/>
+                <w:b w:val="0"/>
+                <w:sz w:val="17"/>
+              </w:rPr>
+              <w:t>12.83%</w:t>
+            </w:r>
+          </w:p>
+        </w:tc>
+        <w:tc>
+          <w:tcPr>
+            <w:tcW w:type="dxa" w:w="1296"/>
+            <w:vAlign w:val="center"/>
+            <w:tcMar>
+              <w:top w:w="80" w:type="dxa"/>
+              <w:start w:w="100" w:type="dxa"/>
+              <w:bottom w:w="80" w:type="dxa"/>
+              <w:end w:w="100" w:type="dxa"/>
+            </w:tcMar>
+          </w:tcPr>
+          <w:p>
+            <w:pPr>
+              <w:spacing w:after="0" w:line="288" w:lineRule="auto"/>
+              <w:jc w:val="center"/>
+            </w:pPr>
+            <w:r>
+              <w:rPr>
+                <w:rFonts w:ascii="Times New Roman" w:hAnsi="Times New Roman" w:eastAsia="宋体"/>
+                <w:b w:val="0"/>
+                <w:sz w:val="17"/>
+              </w:rPr>
+              <w:t>3.08%</w:t>
+            </w:r>
+          </w:p>
+        </w:tc>
+        <w:tc>
+          <w:tcPr>
+            <w:tcW w:type="dxa" w:w="1296"/>
+            <w:vAlign w:val="center"/>
+            <w:tcMar>
+              <w:top w:w="80" w:type="dxa"/>
+              <w:start w:w="100" w:type="dxa"/>
+              <w:bottom w:w="80" w:type="dxa"/>
+              <w:end w:w="100" w:type="dxa"/>
+            </w:tcMar>
+          </w:tcPr>
+          <w:p>
+            <w:pPr>
+              <w:spacing w:after="0" w:line="288" w:lineRule="auto"/>
+              <w:jc w:val="center"/>
+            </w:pPr>
+            <w:r>
+              <w:rPr>
+                <w:rFonts w:ascii="Times New Roman" w:hAnsi="Times New Roman" w:eastAsia="宋体"/>
+                <w:b w:val="0"/>
+                <w:sz w:val="17"/>
+              </w:rPr>
+              <w:t>4.63 (4.29–4.99)</w:t>
+            </w:r>
+          </w:p>
+        </w:tc>
+      </w:tr>
+      <w:tr>
+        <w:tc>
+          <w:tcPr>
+            <w:tcW w:type="dxa" w:w="1296"/>
+            <w:vAlign w:val="center"/>
+            <w:tcMar>
+              <w:top w:w="80" w:type="dxa"/>
+              <w:start w:w="100" w:type="dxa"/>
+              <w:bottom w:w="80" w:type="dxa"/>
+              <w:end w:w="100" w:type="dxa"/>
+            </w:tcMar>
+          </w:tcPr>
+          <w:p>
+            <w:pPr>
+              <w:spacing w:after="0" w:line="288" w:lineRule="auto"/>
+              <w:jc w:val="center"/>
+            </w:pPr>
+            <w:r>
+              <w:rPr>
+                <w:rFonts w:ascii="Times New Roman" w:hAnsi="Times New Roman" w:eastAsia="宋体"/>
+                <w:b w:val="0"/>
+                <w:sz w:val="17"/>
+              </w:rPr>
+              <w:t>2019 Z-drugs黑框警告</w:t>
+            </w:r>
+          </w:p>
+        </w:tc>
+        <w:tc>
+          <w:tcPr>
+            <w:tcW w:type="dxa" w:w="1296"/>
+            <w:vAlign w:val="center"/>
+            <w:tcMar>
+              <w:top w:w="80" w:type="dxa"/>
+              <w:start w:w="100" w:type="dxa"/>
+              <w:bottom w:w="80" w:type="dxa"/>
+              <w:end w:w="100" w:type="dxa"/>
+            </w:tcMar>
+          </w:tcPr>
+          <w:p>
+            <w:pPr>
+              <w:spacing w:after="0" w:line="288" w:lineRule="auto"/>
+              <w:jc w:val="center"/>
+            </w:pPr>
+            <w:r>
+              <w:rPr>
+                <w:rFonts w:ascii="Times New Roman" w:hAnsi="Times New Roman" w:eastAsia="宋体"/>
+                <w:b w:val="0"/>
+                <w:sz w:val="17"/>
+              </w:rPr>
+              <w:t>2004-2018</w:t>
+            </w:r>
+          </w:p>
+        </w:tc>
+        <w:tc>
+          <w:tcPr>
+            <w:tcW w:type="dxa" w:w="1296"/>
+            <w:vAlign w:val="center"/>
+            <w:tcMar>
+              <w:top w:w="80" w:type="dxa"/>
+              <w:start w:w="100" w:type="dxa"/>
+              <w:bottom w:w="80" w:type="dxa"/>
+              <w:end w:w="100" w:type="dxa"/>
+            </w:tcMar>
+          </w:tcPr>
+          <w:p>
+            <w:pPr>
+              <w:spacing w:after="0" w:line="288" w:lineRule="auto"/>
+              <w:jc w:val="center"/>
+            </w:pPr>
+            <w:r>
+              <w:rPr>
+                <w:rFonts w:ascii="Times New Roman" w:hAnsi="Times New Roman" w:eastAsia="宋体"/>
+                <w:b w:val="0"/>
+                <w:sz w:val="17"/>
+              </w:rPr>
+              <w:t>4,518</w:t>
+            </w:r>
+          </w:p>
+        </w:tc>
+        <w:tc>
+          <w:tcPr>
+            <w:tcW w:type="dxa" w:w="1296"/>
+            <w:vAlign w:val="center"/>
+            <w:tcMar>
+              <w:top w:w="80" w:type="dxa"/>
+              <w:start w:w="100" w:type="dxa"/>
+              <w:bottom w:w="80" w:type="dxa"/>
+              <w:end w:w="100" w:type="dxa"/>
+            </w:tcMar>
+          </w:tcPr>
+          <w:p>
+            <w:pPr>
+              <w:spacing w:after="0" w:line="288" w:lineRule="auto"/>
+              <w:jc w:val="center"/>
+            </w:pPr>
+            <w:r>
+              <w:rPr>
+                <w:rFonts w:ascii="Times New Roman" w:hAnsi="Times New Roman" w:eastAsia="宋体"/>
+                <w:b w:val="0"/>
+                <w:sz w:val="17"/>
+              </w:rPr>
+              <w:t>606</w:t>
+            </w:r>
+          </w:p>
+        </w:tc>
+        <w:tc>
+          <w:tcPr>
+            <w:tcW w:type="dxa" w:w="1296"/>
+            <w:vAlign w:val="center"/>
+            <w:tcMar>
+              <w:top w:w="80" w:type="dxa"/>
+              <w:start w:w="100" w:type="dxa"/>
+              <w:bottom w:w="80" w:type="dxa"/>
+              <w:end w:w="100" w:type="dxa"/>
+            </w:tcMar>
+          </w:tcPr>
+          <w:p>
+            <w:pPr>
+              <w:spacing w:after="0" w:line="288" w:lineRule="auto"/>
+              <w:jc w:val="center"/>
+            </w:pPr>
+            <w:r>
+              <w:rPr>
+                <w:rFonts w:ascii="Times New Roman" w:hAnsi="Times New Roman" w:eastAsia="宋体"/>
+                <w:b w:val="0"/>
+                <w:sz w:val="17"/>
+              </w:rPr>
+              <w:t>13.41%</w:t>
+            </w:r>
+          </w:p>
+        </w:tc>
+        <w:tc>
+          <w:tcPr>
+            <w:tcW w:type="dxa" w:w="1296"/>
+            <w:vAlign w:val="center"/>
+            <w:tcMar>
+              <w:top w:w="80" w:type="dxa"/>
+              <w:start w:w="100" w:type="dxa"/>
+              <w:bottom w:w="80" w:type="dxa"/>
+              <w:end w:w="100" w:type="dxa"/>
+            </w:tcMar>
+          </w:tcPr>
+          <w:p>
+            <w:pPr>
+              <w:spacing w:after="0" w:line="288" w:lineRule="auto"/>
+              <w:jc w:val="center"/>
+            </w:pPr>
+            <w:r>
+              <w:rPr>
+                <w:rFonts w:ascii="Times New Roman" w:hAnsi="Times New Roman" w:eastAsia="宋体"/>
+                <w:b w:val="0"/>
+                <w:sz w:val="17"/>
+              </w:rPr>
+              <w:t>3.37%</w:t>
+            </w:r>
+          </w:p>
+        </w:tc>
+        <w:tc>
+          <w:tcPr>
+            <w:tcW w:type="dxa" w:w="1296"/>
+            <w:vAlign w:val="center"/>
+            <w:tcMar>
+              <w:top w:w="80" w:type="dxa"/>
+              <w:start w:w="100" w:type="dxa"/>
+              <w:bottom w:w="80" w:type="dxa"/>
+              <w:end w:w="100" w:type="dxa"/>
+            </w:tcMar>
+          </w:tcPr>
+          <w:p>
+            <w:pPr>
+              <w:spacing w:after="0" w:line="288" w:lineRule="auto"/>
+              <w:jc w:val="center"/>
+            </w:pPr>
+            <w:r>
+              <w:rPr>
+                <w:rFonts w:ascii="Times New Roman" w:hAnsi="Times New Roman" w:eastAsia="宋体"/>
+                <w:b w:val="0"/>
+                <w:sz w:val="17"/>
+              </w:rPr>
+              <w:t>4.44 (4.07–4.84)</w:t>
+            </w:r>
+          </w:p>
+        </w:tc>
+      </w:tr>
+      <w:tr>
+        <w:tc>
+          <w:tcPr>
+            <w:tcW w:type="dxa" w:w="1296"/>
+            <w:vAlign w:val="center"/>
+            <w:tcMar>
+              <w:top w:w="80" w:type="dxa"/>
+              <w:start w:w="100" w:type="dxa"/>
+              <w:bottom w:w="80" w:type="dxa"/>
+              <w:end w:w="100" w:type="dxa"/>
+            </w:tcMar>
+          </w:tcPr>
+          <w:p>
+            <w:pPr>
+              <w:spacing w:after="0" w:line="288" w:lineRule="auto"/>
+              <w:jc w:val="center"/>
+            </w:pPr>
+            <w:r>
+              <w:rPr>
+                <w:rFonts w:ascii="Times New Roman" w:hAnsi="Times New Roman" w:eastAsia="宋体"/>
+                <w:b w:val="0"/>
+                <w:sz w:val="17"/>
+              </w:rPr>
+              <w:t>2019 Z-drugs黑框警告</w:t>
+            </w:r>
+          </w:p>
+        </w:tc>
+        <w:tc>
+          <w:tcPr>
+            <w:tcW w:type="dxa" w:w="1296"/>
+            <w:vAlign w:val="center"/>
+            <w:tcMar>
+              <w:top w:w="80" w:type="dxa"/>
+              <w:start w:w="100" w:type="dxa"/>
+              <w:bottom w:w="80" w:type="dxa"/>
+              <w:end w:w="100" w:type="dxa"/>
+            </w:tcMar>
+          </w:tcPr>
+          <w:p>
+            <w:pPr>
+              <w:spacing w:after="0" w:line="288" w:lineRule="auto"/>
+              <w:jc w:val="center"/>
+            </w:pPr>
+            <w:r>
+              <w:rPr>
+                <w:rFonts w:ascii="Times New Roman" w:hAnsi="Times New Roman" w:eastAsia="宋体"/>
+                <w:b w:val="0"/>
+                <w:sz w:val="17"/>
+              </w:rPr>
+              <w:t>2019-2025</w:t>
+            </w:r>
+          </w:p>
+        </w:tc>
+        <w:tc>
+          <w:tcPr>
+            <w:tcW w:type="dxa" w:w="1296"/>
+            <w:vAlign w:val="center"/>
+            <w:tcMar>
+              <w:top w:w="80" w:type="dxa"/>
+              <w:start w:w="100" w:type="dxa"/>
+              <w:bottom w:w="80" w:type="dxa"/>
+              <w:end w:w="100" w:type="dxa"/>
+            </w:tcMar>
+          </w:tcPr>
+          <w:p>
+            <w:pPr>
+              <w:spacing w:after="0" w:line="288" w:lineRule="auto"/>
+              <w:jc w:val="center"/>
+            </w:pPr>
+            <w:r>
+              <w:rPr>
+                <w:rFonts w:ascii="Times New Roman" w:hAnsi="Times New Roman" w:eastAsia="宋体"/>
+                <w:b w:val="0"/>
+                <w:sz w:val="17"/>
+              </w:rPr>
+              <w:t>3,280</w:t>
+            </w:r>
+          </w:p>
+        </w:tc>
+        <w:tc>
+          <w:tcPr>
+            <w:tcW w:type="dxa" w:w="1296"/>
+            <w:vAlign w:val="center"/>
+            <w:tcMar>
+              <w:top w:w="80" w:type="dxa"/>
+              <w:start w:w="100" w:type="dxa"/>
+              <w:bottom w:w="80" w:type="dxa"/>
+              <w:end w:w="100" w:type="dxa"/>
+            </w:tcMar>
+          </w:tcPr>
+          <w:p>
+            <w:pPr>
+              <w:spacing w:after="0" w:line="288" w:lineRule="auto"/>
+              <w:jc w:val="center"/>
+            </w:pPr>
+            <w:r>
+              <w:rPr>
+                <w:rFonts w:ascii="Times New Roman" w:hAnsi="Times New Roman" w:eastAsia="宋体"/>
+                <w:b w:val="0"/>
+                <w:sz w:val="17"/>
+              </w:rPr>
+              <w:t>437</w:t>
+            </w:r>
+          </w:p>
+        </w:tc>
+        <w:tc>
+          <w:tcPr>
+            <w:tcW w:type="dxa" w:w="1296"/>
+            <w:vAlign w:val="center"/>
+            <w:tcMar>
+              <w:top w:w="80" w:type="dxa"/>
+              <w:start w:w="100" w:type="dxa"/>
+              <w:bottom w:w="80" w:type="dxa"/>
+              <w:end w:w="100" w:type="dxa"/>
+            </w:tcMar>
+          </w:tcPr>
+          <w:p>
+            <w:pPr>
+              <w:spacing w:after="0" w:line="288" w:lineRule="auto"/>
+              <w:jc w:val="center"/>
+            </w:pPr>
+            <w:r>
+              <w:rPr>
+                <w:rFonts w:ascii="Times New Roman" w:hAnsi="Times New Roman" w:eastAsia="宋体"/>
+                <w:b w:val="0"/>
+                <w:sz w:val="17"/>
+              </w:rPr>
+              <w:t>13.32%</w:t>
+            </w:r>
+          </w:p>
+        </w:tc>
+        <w:tc>
+          <w:tcPr>
+            <w:tcW w:type="dxa" w:w="1296"/>
+            <w:vAlign w:val="center"/>
+            <w:tcMar>
+              <w:top w:w="80" w:type="dxa"/>
+              <w:start w:w="100" w:type="dxa"/>
+              <w:bottom w:w="80" w:type="dxa"/>
+              <w:end w:w="100" w:type="dxa"/>
+            </w:tcMar>
+          </w:tcPr>
+          <w:p>
+            <w:pPr>
+              <w:spacing w:after="0" w:line="288" w:lineRule="auto"/>
+              <w:jc w:val="center"/>
+            </w:pPr>
+            <w:r>
+              <w:rPr>
+                <w:rFonts w:ascii="Times New Roman" w:hAnsi="Times New Roman" w:eastAsia="宋体"/>
+                <w:b w:val="0"/>
+                <w:sz w:val="17"/>
+              </w:rPr>
+              <w:t>2.97%</w:t>
+            </w:r>
+          </w:p>
+        </w:tc>
+        <w:tc>
+          <w:tcPr>
+            <w:tcW w:type="dxa" w:w="1296"/>
+            <w:vAlign w:val="center"/>
+            <w:tcMar>
+              <w:top w:w="80" w:type="dxa"/>
+              <w:start w:w="100" w:type="dxa"/>
+              <w:bottom w:w="80" w:type="dxa"/>
+              <w:end w:w="100" w:type="dxa"/>
+            </w:tcMar>
+          </w:tcPr>
+          <w:p>
+            <w:pPr>
+              <w:spacing w:after="0" w:line="288" w:lineRule="auto"/>
+              <w:jc w:val="center"/>
+            </w:pPr>
+            <w:r>
+              <w:rPr>
+                <w:rFonts w:ascii="Times New Roman" w:hAnsi="Times New Roman" w:eastAsia="宋体"/>
+                <w:b w:val="0"/>
+                <w:sz w:val="17"/>
+              </w:rPr>
+              <w:t>5.02 (4.54–5.55)</w:t>
+            </w:r>
+          </w:p>
+        </w:tc>
+      </w:tr>
+    </w:tbl>
     <w:p>
       <w:pPr>
         <w:pStyle w:val="21"/>
@@ -37591,146 +38649,16 @@
     </w:p>
     <w:p>
       <w:pPr>
-        <w:spacing w:after="120" w:line="360" w:lineRule="auto"/>
+        <w:spacing w:after="120" w:line="360" w:lineRule="auto" w:before="0"/>
         <w:ind w:firstLine="420"/>
       </w:pPr>
       <w:r>
         <w:rPr>
-          <w:sz w:val="21"/>
-        </w:rPr>
-        <w:t>本章基于</w:t>
-      </w:r>
-      <w:r>
-        <w:rPr>
-          <w:sz w:val="21"/>
-        </w:rPr>
-        <w:t xml:space="preserve"> 2004-2025 </w:t>
-      </w:r>
-      <w:r>
-        <w:rPr>
-          <w:sz w:val="21"/>
-        </w:rPr>
-        <w:t>年</w:t>
-      </w:r>
-      <w:r>
-        <w:rPr>
-          <w:sz w:val="21"/>
-        </w:rPr>
-        <w:t xml:space="preserve"> FAERS </w:t>
-      </w:r>
-      <w:r>
-        <w:rPr>
-          <w:sz w:val="21"/>
-        </w:rPr>
-        <w:t>老年病例，对唑吡坦相关跌倒事件进行了信号挖掘和校正分析。主分析显示，唑吡坦</w:t>
-      </w:r>
-      <w:r>
-        <w:rPr>
-          <w:sz w:val="21"/>
-        </w:rPr>
-        <w:t xml:space="preserve"> suspect </w:t>
-      </w:r>
-      <w:r>
-        <w:rPr>
-          <w:sz w:val="21"/>
-        </w:rPr>
-        <w:t>暴露与狭义跌倒事件之间存在明显不成比例报告信号，</w:t>
-      </w:r>
-      <w:r>
-        <w:rPr>
-          <w:sz w:val="21"/>
-        </w:rPr>
-        <w:t xml:space="preserve">ROR </w:t>
-      </w:r>
-      <w:r>
-        <w:rPr>
-          <w:sz w:val="21"/>
-        </w:rPr>
-        <w:t>为</w:t>
-      </w:r>
-      <w:r>
-        <w:rPr>
-          <w:sz w:val="21"/>
-        </w:rPr>
-        <w:t xml:space="preserve"> 4.73</w:t>
-      </w:r>
-      <w:r>
-        <w:rPr>
-          <w:sz w:val="21"/>
-        </w:rPr>
-        <w:t>，</w:t>
-      </w:r>
-      <w:r>
-        <w:rPr>
-          <w:sz w:val="21"/>
-        </w:rPr>
-        <w:t xml:space="preserve">PRR </w:t>
-      </w:r>
-      <w:r>
-        <w:rPr>
-          <w:sz w:val="21"/>
-        </w:rPr>
-        <w:t>为</w:t>
-      </w:r>
-      <w:r>
-        <w:rPr>
-          <w:sz w:val="21"/>
-        </w:rPr>
-        <w:t xml:space="preserve"> 4.23</w:t>
-      </w:r>
-      <w:r>
-        <w:rPr>
-          <w:sz w:val="21"/>
-        </w:rPr>
-        <w:t>，</w:t>
-      </w:r>
-      <w:r>
-        <w:rPr>
-          <w:sz w:val="21"/>
-        </w:rPr>
-        <w:t xml:space="preserve">IC </w:t>
-      </w:r>
-      <w:r>
-        <w:rPr>
-          <w:sz w:val="21"/>
-        </w:rPr>
-        <w:t>为</w:t>
-      </w:r>
-      <w:r>
-        <w:rPr>
-          <w:sz w:val="21"/>
-        </w:rPr>
-        <w:t xml:space="preserve"> 2.07</w:t>
-      </w:r>
-      <w:r>
-        <w:rPr>
-          <w:sz w:val="21"/>
-        </w:rPr>
-        <w:t>，</w:t>
-      </w:r>
-      <w:r>
-        <w:rPr>
-          <w:sz w:val="21"/>
-        </w:rPr>
-        <w:t xml:space="preserve">EBGM </w:t>
-      </w:r>
-      <w:r>
-        <w:rPr>
-          <w:sz w:val="21"/>
-        </w:rPr>
-        <w:t>为</w:t>
-      </w:r>
-      <w:r>
-        <w:rPr>
-          <w:sz w:val="21"/>
-        </w:rPr>
-        <w:t xml:space="preserve"> 4.19</w:t>
-      </w:r>
-      <w:r>
-        <w:rPr>
-          <w:sz w:val="21"/>
-        </w:rPr>
-        <w:t>，四种方法均达到阳性信号标准。</w:t>
+          <w:rFonts w:ascii="Times New Roman" w:hAnsi="Times New Roman" w:eastAsia="宋体"/>
+          <w:b w:val="0"/>
+          <w:sz w:val="21"/>
+        </w:rPr>
+        <w:t>本章基于 2004-2025 年 FAERS 老年病例，对唑吡坦相关跌倒事件进行了信号挖掘和校正分析。主分析显示，唑吡坦 suspect 暴露与狭义跌倒事件之间存在明显不成比例报告信号，ROR 为 4.73，PRR 为 4.23，IC 为 2.07，EBGM 为 4.19，四种方法均达到阳性信号标准。 年度趋势和监管节点前后分层分析进一步显示，唑吡坦相关狭义跌倒报告信号在 2004-2025 年长期观察中持续存在；2013 年后报告比例有所降低但信号未消失，2019 年后 ROR 仍保持较高水平。</w:t>
       </w:r>
     </w:p>
     <w:p>
@@ -43042,6 +43970,27 @@
     </w:p>
     <w:p>
       <w:pPr>
+        <w:spacing w:line="360" w:lineRule="auto" w:before="0" w:after="120"/>
+        <w:ind w:firstLine="420"/>
+      </w:pPr>
+      <w:r>
+        <w:rPr>
+          <w:rFonts w:ascii="Times New Roman" w:hAnsi="Times New Roman" w:eastAsia="宋体"/>
+          <w:b w:val="0"/>
+          <w:sz w:val="21"/>
+        </w:rPr>
+      </w:r>
+      <w:r>
+        <w:rPr>
+          <w:rFonts w:ascii="Times New Roman" w:hAnsi="Times New Roman" w:eastAsia="宋体"/>
+          <w:b w:val="0"/>
+          <w:sz w:val="21"/>
+        </w:rPr>
+        <w:t>新增趋势分析补充说明了本研究时间跨度的价值。2013 年前后分层显示，FDA 唑吡坦剂量安全沟通后，唑吡坦 suspect 病例中的狭义跌倒报告比例从 15.46% 降至 12.83%，但 ROR 仍保持在 4 以上。2019 年 Z-drugs 黑框警告后，跌倒报告比例与此前接近，ROR 为 5.02，提示报告信号在近年仍持续存在。该结果将 FDA 安全警示背景与本研究长周期 FAERS 数据联系起来，但仍应解释为报告模式变化，而不是监管措施导致风险变化。</w:t>
+      </w:r>
+    </w:p>
+    <w:p>
+      <w:pPr>
         <w:spacing w:after="120" w:line="360" w:lineRule="auto"/>
         <w:ind w:firstLine="420"/>
       </w:pPr>
@@ -44717,6 +45666,20 @@
     </w:p>
     <w:p>
       <w:pPr>
+        <w:spacing w:after="120" w:line="360" w:lineRule="auto" w:before="0"/>
+        <w:ind w:firstLine="420"/>
+      </w:pPr>
+      <w:r>
+        <w:rPr>
+          <w:rFonts w:ascii="Times New Roman" w:hAnsi="Times New Roman" w:eastAsia="宋体"/>
+          <w:b w:val="0"/>
+          <w:sz w:val="21"/>
+        </w:rPr>
+        <w:t>第一，数据时间跨度较长。本研究覆盖 2004-2025 年 FAERS 数据，不仅能够较全面地反映唑吡坦上市后长期不良事件报告情况，还进一步通过年度趋势、3 年滚动 ROR 和 2013/2019 年监管节点前后分层分析，观察唑吡坦相关跌倒报告信号的长期变化。</w:t>
+      </w:r>
+    </w:p>
+    <w:p>
+      <w:pPr>
         <w:spacing w:after="120" w:line="360" w:lineRule="auto"/>
         <w:ind w:firstLine="420"/>
       </w:pPr>
@@ -44724,31 +45687,7 @@
         <w:rPr>
           <w:sz w:val="21"/>
         </w:rPr>
-        <w:t>第一，数据时间跨度较长。本研究覆盖</w:t>
-      </w:r>
-      <w:r>
-        <w:rPr>
-          <w:sz w:val="21"/>
-        </w:rPr>
-        <w:t xml:space="preserve"> 2004-2025 </w:t>
-      </w:r>
-      <w:r>
-        <w:rPr>
-          <w:sz w:val="21"/>
-        </w:rPr>
-        <w:t>年</w:t>
-      </w:r>
-      <w:r>
-        <w:rPr>
-          <w:sz w:val="21"/>
-        </w:rPr>
-        <w:t xml:space="preserve"> FAERS </w:t>
-      </w:r>
-      <w:r>
-        <w:rPr>
-          <w:sz w:val="21"/>
-        </w:rPr>
-        <w:t>数据，能够较全面地反映唑吡坦上市后长期不良事件报告情况。</w:t>
+        <w:t>第二，研究对象聚焦老年人群。老年患者是跌倒高风险人群，也是镇静催眠药安全性管理的重点人群。聚焦这一人群有较强的临床药学意义。</w:t>
       </w:r>
     </w:p>
     <w:p>
@@ -44760,7 +45699,31 @@
         <w:rPr>
           <w:sz w:val="21"/>
         </w:rPr>
-        <w:t>第二，研究对象聚焦老年人群。老年患者是跌倒高风险人群，也是镇静催眠药安全性管理的重点人群。聚焦这一人群有较强的临床药学意义。</w:t>
+        <w:t>第三，暴露和结局定义较完整。本研究同时设置</w:t>
+      </w:r>
+      <w:r>
+        <w:rPr>
+          <w:sz w:val="21"/>
+        </w:rPr>
+        <w:t xml:space="preserve"> PS+SS </w:t>
+      </w:r>
+      <w:r>
+        <w:rPr>
+          <w:sz w:val="21"/>
+        </w:rPr>
+        <w:t>主分析和</w:t>
+      </w:r>
+      <w:r>
+        <w:rPr>
+          <w:sz w:val="21"/>
+        </w:rPr>
+        <w:t xml:space="preserve"> PS only </w:t>
+      </w:r>
+      <w:r>
+        <w:rPr>
+          <w:sz w:val="21"/>
+        </w:rPr>
+        <w:t>敏感性分析，同时设置狭义跌倒和广义跌倒相关事件两类结局，有利于观察结果稳定性。</w:t>
       </w:r>
     </w:p>
     <w:p>
@@ -44772,31 +45735,55 @@
         <w:rPr>
           <w:sz w:val="21"/>
         </w:rPr>
-        <w:t>第三，暴露和结局定义较完整。本研究同时设置</w:t>
-      </w:r>
-      <w:r>
-        <w:rPr>
-          <w:sz w:val="21"/>
-        </w:rPr>
-        <w:t xml:space="preserve"> PS+SS </w:t>
-      </w:r>
-      <w:r>
-        <w:rPr>
-          <w:sz w:val="21"/>
-        </w:rPr>
-        <w:t>主分析和</w:t>
-      </w:r>
-      <w:r>
-        <w:rPr>
-          <w:sz w:val="21"/>
-        </w:rPr>
-        <w:t xml:space="preserve"> PS only </w:t>
-      </w:r>
-      <w:r>
-        <w:rPr>
-          <w:sz w:val="21"/>
-        </w:rPr>
-        <w:t>敏感性分析，同时设置狭义跌倒和广义跌倒相关事件两类结局，有利于观察结果稳定性。</w:t>
+        <w:t>第四，使用多种信号检测方法。本研究同时计算</w:t>
+      </w:r>
+      <w:r>
+        <w:rPr>
+          <w:sz w:val="21"/>
+        </w:rPr>
+        <w:t xml:space="preserve"> ROR</w:t>
+      </w:r>
+      <w:r>
+        <w:rPr>
+          <w:sz w:val="21"/>
+        </w:rPr>
+        <w:t>、</w:t>
+      </w:r>
+      <w:r>
+        <w:rPr>
+          <w:sz w:val="21"/>
+        </w:rPr>
+        <w:t>PRR</w:t>
+      </w:r>
+      <w:r>
+        <w:rPr>
+          <w:sz w:val="21"/>
+        </w:rPr>
+        <w:t>、</w:t>
+      </w:r>
+      <w:r>
+        <w:rPr>
+          <w:sz w:val="21"/>
+        </w:rPr>
+        <w:t xml:space="preserve">IC </w:t>
+      </w:r>
+      <w:r>
+        <w:rPr>
+          <w:sz w:val="21"/>
+        </w:rPr>
+        <w:t>和</w:t>
+      </w:r>
+      <w:r>
+        <w:rPr>
+          <w:sz w:val="21"/>
+        </w:rPr>
+        <w:t xml:space="preserve"> EBGM</w:t>
+      </w:r>
+      <w:r>
+        <w:rPr>
+          <w:sz w:val="21"/>
+        </w:rPr>
+        <w:t>，避免单一算法造成结果片面。</w:t>
       </w:r>
     </w:p>
     <w:p>
@@ -44808,56 +45795,29 @@
         <w:rPr>
           <w:sz w:val="21"/>
         </w:rPr>
-        <w:t>第四，使用多种信号检测方法。本研究同时计算</w:t>
-      </w:r>
-      <w:r>
-        <w:rPr>
-          <w:sz w:val="21"/>
-        </w:rPr>
-        <w:t xml:space="preserve"> ROR</w:t>
-      </w:r>
-      <w:r>
-        <w:rPr>
-          <w:sz w:val="21"/>
-        </w:rPr>
-        <w:t>、</w:t>
-      </w:r>
-      <w:r>
-        <w:rPr>
-          <w:sz w:val="21"/>
-        </w:rPr>
-        <w:t>PRR</w:t>
-      </w:r>
-      <w:r>
-        <w:rPr>
-          <w:sz w:val="21"/>
-        </w:rPr>
-        <w:t>、</w:t>
-      </w:r>
-      <w:r>
-        <w:rPr>
-          <w:sz w:val="21"/>
-        </w:rPr>
-        <w:t xml:space="preserve">IC </w:t>
-      </w:r>
-      <w:r>
-        <w:rPr>
-          <w:sz w:val="21"/>
-        </w:rPr>
-        <w:t>和</w:t>
-      </w:r>
-      <w:r>
-        <w:rPr>
-          <w:sz w:val="21"/>
-        </w:rPr>
-        <w:t xml:space="preserve"> EBGM</w:t>
-      </w:r>
-      <w:r>
-        <w:rPr>
-          <w:sz w:val="21"/>
-        </w:rPr>
-        <w:t>，避免单一算法造成结果片面。</w:t>
-      </w:r>
+        <w:lastRenderedPageBreak/>
+        <w:t>第五，结合多因素校正和机器学习辅助分析。多因素模型用于控制部分可获得协变量，机器学习用于探索多维报告特征组合，两者为主信号分析提供补充。</w:t>
+      </w:r>
+    </w:p>
+    <w:p>
+      <w:pPr>
+        <w:pStyle w:val="21"/>
+        <w:spacing w:before="160" w:after="80"/>
+      </w:pPr>
+      <w:bookmarkStart w:id="87" w:name="_Toc230281386"/>
+      <w:r>
+        <w:rPr>
+          <w:rFonts w:ascii="Times New Roman" w:eastAsia="宋体" w:hAnsi="Times New Roman"/>
+        </w:rPr>
+        <w:t xml:space="preserve">6.9 </w:t>
+      </w:r>
+      <w:r>
+        <w:rPr>
+          <w:rFonts w:ascii="Times New Roman" w:eastAsia="宋体" w:hAnsi="Times New Roman"/>
+        </w:rPr>
+        <w:t>本研究的局限</w:t>
+      </w:r>
+      <w:bookmarkEnd w:id="87"/>
     </w:p>
     <w:p>
       <w:pPr>
@@ -44868,29 +45828,8 @@
         <w:rPr>
           <w:sz w:val="21"/>
         </w:rPr>
-        <w:lastRenderedPageBreak/>
-        <w:t>第五，结合多因素校正和机器学习辅助分析。多因素模型用于控制部分可获得协变量，机器学习用于探索多维报告特征组合，两者为主信号分析提供补充。</w:t>
-      </w:r>
-    </w:p>
-    <w:p>
-      <w:pPr>
-        <w:pStyle w:val="21"/>
-        <w:spacing w:before="160" w:after="80"/>
-      </w:pPr>
-      <w:bookmarkStart w:id="87" w:name="_Toc230281386"/>
-      <w:r>
-        <w:rPr>
-          <w:rFonts w:ascii="Times New Roman" w:eastAsia="宋体" w:hAnsi="Times New Roman"/>
-        </w:rPr>
-        <w:t xml:space="preserve">6.9 </w:t>
-      </w:r>
-      <w:r>
-        <w:rPr>
-          <w:rFonts w:ascii="Times New Roman" w:eastAsia="宋体" w:hAnsi="Times New Roman"/>
-        </w:rPr>
-        <w:t>本研究的局限</w:t>
-      </w:r>
-      <w:bookmarkEnd w:id="87"/>
+        <w:t>本研究也存在明显局限。</w:t>
+      </w:r>
     </w:p>
     <w:p>
       <w:pPr>
@@ -44901,18 +45840,6 @@
         <w:rPr>
           <w:sz w:val="21"/>
         </w:rPr>
-        <w:t>本研究也存在明显局限。</w:t>
-      </w:r>
-    </w:p>
-    <w:p>
-      <w:pPr>
-        <w:spacing w:after="120" w:line="360" w:lineRule="auto"/>
-        <w:ind w:firstLine="420"/>
-      </w:pPr>
-      <w:r>
-        <w:rPr>
-          <w:sz w:val="21"/>
-        </w:rPr>
         <w:t>第一，</w:t>
       </w:r>
       <w:r>
@@ -44963,6 +45890,27 @@
           <w:sz w:val="21"/>
         </w:rPr>
         <w:t>。</w:t>
+      </w:r>
+    </w:p>
+    <w:p>
+      <w:pPr>
+        <w:spacing w:line="360" w:lineRule="auto" w:before="0" w:after="120"/>
+        <w:ind w:firstLine="420"/>
+      </w:pPr>
+      <w:r>
+        <w:rPr>
+          <w:rFonts w:ascii="Times New Roman" w:hAnsi="Times New Roman" w:eastAsia="宋体"/>
+          <w:b w:val="0"/>
+          <w:sz w:val="21"/>
+        </w:rPr>
+      </w:r>
+      <w:r>
+        <w:rPr>
+          <w:rFonts w:ascii="Times New Roman" w:hAnsi="Times New Roman" w:eastAsia="宋体"/>
+          <w:b w:val="0"/>
+          <w:sz w:val="21"/>
+        </w:rPr>
+        <w:t>此外，年度趋势和监管节点前后分层分析容易受到监管警示、媒体关注、诉讼、报告制度变化和临床认知变化的影响。因此，本研究不能根据 2013 年或 2019 年前后的报告比例或 ROR 变化，推断 FDA 安全沟通本身导致了真实风险升高或降低。</w:t>
       </w:r>
     </w:p>
     <w:p>
@@ -47770,6 +48718,18 @@
         <w:t>[70] Efficacy and safety of Z-substances in the management of insomnia in older adults: a systematic review for the development of recommendations to reduce potentially inappropriate prescribing[J]. BMC Geriatrics, 2022, 22:87. DOI:10.1186/s12877-022-02757-6.</w:t>
       </w:r>
     </w:p>
+    <w:p/>
+    <w:p/>
+    <w:p/>
+    <w:p/>
+    <w:p/>
+    <w:p/>
+    <w:p/>
+    <w:p/>
+    <w:p/>
+    <w:p/>
+    <w:p/>
+    <w:p/>
     <w:sectPr>
       <w:headerReference w:type="default" r:id="rId10"/>
       <w:footerReference w:type="default" r:id="rId11"/>

</xml_diff>